<commit_message>
Alteraçoes rapidas (Main, rotaLançamento, rotaMain, rotaOrcamento) e Uploads
</commit_message>
<xml_diff>
--- a/uploads/Proposta/PropostaRAM - PRODUTORES_RAM_.docx
+++ b/uploads/Proposta/PropostaRAM - PRODUTORES_RAM_.docx
@@ -614,7 +614,15 @@
             <w:rPr>
               <w:rFonts w:ascii="Abel" w:hAnsi="Abel" w:cs="Abel"/>
             </w:rPr>
+            <w:t xml:space="preserve">VALOR DOS PRODUTORES: R$ 84.000</w:t>
+            <w:br/>
+            <w:t xml:space="preserve">HOSPEDAGEM 5 PESSOAS DE SP : R$ 11.200,00</w:t>
+            <w:br/>
+            <w:t xml:space="preserve">PASSAGEM: R$ 10.000,00</w:t>
+            <w:br/>
             <w:t xml:space="preserve"/>
+            <w:br/>
+            <w:t xml:space="preserve">PROPOSTA INICIAL: R$ 105.200,00</w:t>
           </w:r>
         </w:t>
       </w:r>
@@ -1839,7 +1847,7 @@
           <w:sz w:val="24"/>
           <w:szCs w:val="24"/>
         </w:rPr>
-        <w:t xml:space="preserve">R$ 79.547,40</w:t>
+        <w:t xml:space="preserve">R$ 105.200,00</w:t>
       </w:r>
       <w:r>
         <w:rPr>
@@ -2018,7 +2026,7 @@
           <w:i/>
           <w:iCs/>
         </w:rPr>
-        <w:t xml:space="preserve">29/01/2026</w:t>
+        <w:t xml:space="preserve">24/02/2026</w:t>
       </w:r>
     </w:p>
     <w:p>

</xml_diff>